<commit_message>
Remove homework beam presets and teach mesh selection clearly
</commit_message>
<xml_diff>
--- a/assignments/homework-03/MIE446_HW3_Three_Beams.docx
+++ b/assignments/homework-03/MIE446_HW3_Three_Beams.docx
@@ -689,7 +689,7 @@
         <w:rPr>
           <w:rFonts w:asciiTheme="majorBidi" w:hAnsiTheme="majorBidi" w:cstheme="majorBidi"/>
         </w:rPr>
-        <w:t>2. Set L = 450 mm and E = 2200 MPa. Select Solid rectangle, b = 16 mm and h = 8 mm. Check A = 128 mm² and I = 682.67 mm⁴. Remove interior supports and internal hinges, clear existing loads and leave Include self-weight unchecked.</w:t>
+        <w:t>2. Set L = 450 mm and E = 2200 MPa. Select Solid rectangle, b = 16 mm and h = 8 mm. Set Requested elements = 30 for all three cases. Check A = 128 mm² and I = 682.67 mm⁴. Remove interior supports and internal hinges, clear existing loads and leave Include self-weight unchecked.</w:t>
       </w:r>
     </w:p>
     <w:p>
@@ -807,21 +807,50 @@
         <w:rPr>
           <w:rFonts w:asciiTheme="majorBidi" w:hAnsiTheme="majorBidi" w:cstheme="majorBidi"/>
         </w:rPr>
-        <w:t xml:space="preserve">3. Use </w:t>
+        <w:t xml:space="preserve">3. Use Lecture 03 for supports, integration, compatibility and the numerical-mesh explanation. Configure all three models yourself in the blank Beam workspace; no homework preset is supplied.</w:t>
       </w:r>
       <w:hyperlink r:id="rId11">
         <w:r>
           <w:rPr>
             <w:rFonts w:asciiTheme="majorBidi" w:hAnsiTheme="majorBidi" w:cstheme="majorBidi"/>
           </w:rPr>
-          <w:t>Lecture 03</w:t>
+          <w:t/>
         </w:r>
       </w:hyperlink>
       <w:r>
         <w:rPr>
           <w:rFonts w:asciiTheme="majorBidi" w:hAnsiTheme="majorBidi" w:cstheme="majorBidi"/>
         </w:rPr>
-        <w:t xml:space="preserve"> for support conditions and integration/compatibility methods.</w:t>
+        <w:t xml:space="preserve"/>
+      </w:r>
+    </w:p>
+    <w:p>
+      <w:pPr>
+        <w:ind w:left="259" w:hanging="173"/>
+        <w:jc w:val="lowKashida"/>
+        <w:rPr>
+          <w:rFonts w:asciiTheme="majorBidi" w:hAnsiTheme="majorBidi" w:cstheme="majorBidi"/>
+        </w:rPr>
+      </w:pPr>
+      <w:r>
+        <w:rPr>
+          <w:rFonts w:asciiTheme="majorBidi" w:hAnsiTheme="majorBidi" w:cstheme="majorBidi"/>
+        </w:rPr>
+        <w:t xml:space="preserve">Mesh elements are numerical, not physical parts. For 450 mm, N = 10/30/40 gives nominal lengths 45/15/11.25 mm. Use 30; no mesh study is required. See Lecture 03 for accuracy guidance.</w:t>
+      </w:r>
+      <w:hyperlink r:id="rId11">
+        <w:r>
+          <w:rPr>
+            <w:rFonts w:asciiTheme="majorBidi" w:hAnsiTheme="majorBidi" w:cstheme="majorBidi"/>
+          </w:rPr>
+          <w:t/>
+        </w:r>
+      </w:hyperlink>
+      <w:r>
+        <w:rPr>
+          <w:rFonts w:asciiTheme="majorBidi" w:hAnsiTheme="majorBidi" w:cstheme="majorBidi"/>
+        </w:rPr>
+        <w:t xml:space="preserve"/>
       </w:r>
     </w:p>
     <w:sectPr>

</xml_diff>